<commit_message>
Actualizaciones a informe de avance
</commit_message>
<xml_diff>
--- a/Informe_de_avance/Informe_Avance_1.docx
+++ b/Informe_de_avance/Informe_Avance_1.docx
@@ -1127,6 +1127,27 @@
     </w:p>
     <w:p>
       <w:pPr>
+        <w:tabs>
+          <w:tab w:val="right" w:leader="dot" w:pos="9070"/>
+        </w:tabs>
+        <w:spacing w:after="20" w:line="300" w:lineRule="auto"/>
+        <w:rPr>
+          <w:lang w:val="es-AR"/>
+        </w:rPr>
+      </w:pPr>
+      <w:r>
+        <w:rPr>
+          <w:sz w:val="22"/>
+          <w:szCs w:val="22"/>
+          <w:lang w:val="es-AR"/>
+        </w:rPr>
+        <w:t>ANEXO B. DISEÑO DE CIRCUITOS ESQUEMÁTICOS</w:t>
+        <w:tab/>
+        <w:t>22</w:t>
+      </w:r>
+    </w:p>
+    <w:p>
+      <w:pPr>
         <w:spacing w:before="300" w:after="200"/>
         <w:rPr>
           <w:lang w:val="es-AR"/>
@@ -5276,7 +5297,7 @@
           <w:bCs/>
           <w:lang w:val="es-AR"/>
         </w:rPr>
-        <w:t>Conector P1 (Entradas analógicas y alimentación lógica):</w:t>
+        <w:t>Conector P1 (Entradas analógicas, alimentación lógica y salidas de modulación):</w:t>
       </w:r>
     </w:p>
     <w:p>
@@ -5456,7 +5477,7 @@
         <w:rPr>
           <w:lang w:val="es-AR"/>
         </w:rPr>
-        <w:t xml:space="preserve"> Entrada analógica para el eje Y del Joystick A (control de elevación del hombro). </w:t>
+        <w:t xml:space="preserve"> Entrada analógica para el eje X del Joystick A (control de giro de la base). </w:t>
       </w:r>
     </w:p>
     <w:p>
@@ -5501,7 +5522,7 @@
         <w:rPr>
           <w:lang w:val="es-AR"/>
         </w:rPr>
-        <w:t xml:space="preserve"> Entrada analógica para el eje X del Joystick A (control de giro de la base). </w:t>
+        <w:t xml:space="preserve"> Entrada analógica para el eje Y del Joystick A (control de elevación del hombro). </w:t>
       </w:r>
     </w:p>
     <w:p>
@@ -5551,23 +5572,6 @@
     </w:p>
     <w:p>
       <w:pPr>
-        <w:spacing w:after="240" w:line="360" w:lineRule="auto"/>
-        <w:jc w:val="both"/>
-        <w:rPr>
-          <w:lang w:val="es-AR"/>
-        </w:rPr>
-      </w:pPr>
-      <w:r>
-        <w:rPr>
-          <w:b/>
-          <w:bCs/>
-          <w:lang w:val="es-AR"/>
-        </w:rPr>
-        <w:t>Conector P2 (Salidas de modulación, entradas digitales y masa):</w:t>
-      </w:r>
-    </w:p>
-    <w:p>
-      <w:pPr>
         <w:pStyle w:val="ListParagraph"/>
         <w:numPr>
           <w:ilvl w:val="0"/>
@@ -5585,7 +5589,7 @@
           <w:bCs/>
           <w:lang w:val="es-AR"/>
         </w:rPr>
-        <w:t>Pin 29 (</w:t>
+        <w:t>Pin 35 (</w:t>
       </w:r>
       <w:r>
         <w:rPr>
@@ -5594,7 +5598,7 @@
           <w:bCs/>
           <w:lang w:val="es-AR"/>
         </w:rPr>
-        <w:t>GPIO_GND</w:t>
+        <w:t>PWM_MUÑECA</w:t>
       </w:r>
       <w:r>
         <w:rPr>
@@ -5608,7 +5612,7 @@
         <w:rPr>
           <w:lang w:val="es-AR"/>
         </w:rPr>
-        <w:t xml:space="preserve"> Unión de referencia al plano de masa común de potencia y lógica. </w:t>
+        <w:t xml:space="preserve"> Salida PWM de 50 Hz asignada al servomotor de la Muñeca. </w:t>
       </w:r>
     </w:p>
     <w:p>
@@ -5630,7 +5634,7 @@
           <w:bCs/>
           <w:lang w:val="es-AR"/>
         </w:rPr>
-        <w:t>Pin 31 (</w:t>
+        <w:t>Pin 36 (</w:t>
       </w:r>
       <w:r>
         <w:rPr>
@@ -5639,7 +5643,7 @@
           <w:bCs/>
           <w:lang w:val="es-AR"/>
         </w:rPr>
-        <w:t>GPIO0</w:t>
+        <w:t>PWM_BASE</w:t>
       </w:r>
       <w:r>
         <w:rPr>
@@ -5653,21 +5657,7 @@
         <w:rPr>
           <w:lang w:val="es-AR"/>
         </w:rPr>
-        <w:t xml:space="preserve"> Entrada digital con resistencia de </w:t>
-      </w:r>
-      <w:r>
-        <w:rPr>
-          <w:i/>
-          <w:iCs/>
-          <w:lang w:val="es-AR"/>
-        </w:rPr>
-        <w:t xml:space="preserve">pull-up</w:t>
-      </w:r>
-      <w:r>
-        <w:rPr>
-          <w:lang w:val="es-AR"/>
-        </w:rPr>
-        <w:t xml:space="preserve"> para el pulsador de apertura/cierre de la pinza. </w:t>
+        <w:t xml:space="preserve"> Salida PWM de 50 Hz asignada al servomotor de la Base. </w:t>
       </w:r>
     </w:p>
     <w:p>
@@ -5689,7 +5679,7 @@
           <w:bCs/>
           <w:lang w:val="es-AR"/>
         </w:rPr>
-        <w:t>Pin 33 (</w:t>
+        <w:t>Pin 37 (</w:t>
       </w:r>
       <w:r>
         <w:rPr>
@@ -5698,7 +5688,7 @@
           <w:bCs/>
           <w:lang w:val="es-AR"/>
         </w:rPr>
-        <w:t>GPIO1</w:t>
+        <w:t>PWM_CODO</w:t>
       </w:r>
       <w:r>
         <w:rPr>
@@ -5712,7 +5702,7 @@
         <w:rPr>
           <w:lang w:val="es-AR"/>
         </w:rPr>
-        <w:t xml:space="preserve"> Salida PWM de 50 Hz asignada al servomotor de la Base. </w:t>
+        <w:t xml:space="preserve"> Salida PWM de 50 Hz asignada al servomotor del Codo. </w:t>
       </w:r>
     </w:p>
     <w:p>
@@ -5734,7 +5724,7 @@
           <w:bCs/>
           <w:lang w:val="es-AR"/>
         </w:rPr>
-        <w:t>Pin 35 (</w:t>
+        <w:t>Pin 39 (</w:t>
       </w:r>
       <w:r>
         <w:rPr>
@@ -5743,7 +5733,7 @@
           <w:bCs/>
           <w:lang w:val="es-AR"/>
         </w:rPr>
-        <w:t>GPIO2</w:t>
+        <w:t>PWM_HOMBRO</w:t>
       </w:r>
       <w:r>
         <w:rPr>
@@ -5758,6 +5748,23 @@
           <w:lang w:val="es-AR"/>
         </w:rPr>
         <w:t xml:space="preserve"> Salida PWM de 50 Hz asignada al servomotor del Hombro. </w:t>
+      </w:r>
+    </w:p>
+    <w:p>
+      <w:pPr>
+        <w:spacing w:after="240" w:line="360" w:lineRule="auto"/>
+        <w:jc w:val="both"/>
+        <w:rPr>
+          <w:lang w:val="es-AR"/>
+        </w:rPr>
+      </w:pPr>
+      <w:r>
+        <w:rPr>
+          <w:b/>
+          <w:bCs/>
+          <w:lang w:val="es-AR"/>
+        </w:rPr>
+        <w:t>Conector P2 (Masa, entrada digital y salida de la pinza):</w:t>
       </w:r>
     </w:p>
     <w:p>
@@ -5779,7 +5786,7 @@
           <w:bCs/>
           <w:lang w:val="es-AR"/>
         </w:rPr>
-        <w:t>Pin 37 (</w:t>
+        <w:t>Pin 29 (</w:t>
       </w:r>
       <w:r>
         <w:rPr>
@@ -5788,7 +5795,7 @@
           <w:bCs/>
           <w:lang w:val="es-AR"/>
         </w:rPr>
-        <w:t>GPIO3</w:t>
+        <w:t>GPIO_GND</w:t>
       </w:r>
       <w:r>
         <w:rPr>
@@ -5802,7 +5809,7 @@
         <w:rPr>
           <w:lang w:val="es-AR"/>
         </w:rPr>
-        <w:t xml:space="preserve"> Salida PWM de 50 Hz asignada al servomotor del Codo. </w:t>
+        <w:t xml:space="preserve"> Unión de referencia al plano de masa común de potencia y lógica. </w:t>
       </w:r>
     </w:p>
     <w:p>
@@ -5824,7 +5831,7 @@
           <w:bCs/>
           <w:lang w:val="es-AR"/>
         </w:rPr>
-        <w:t>Pin 39 (</w:t>
+        <w:t>Pin 31 (</w:t>
       </w:r>
       <w:r>
         <w:rPr>
@@ -5833,7 +5840,7 @@
           <w:bCs/>
           <w:lang w:val="es-AR"/>
         </w:rPr>
-        <w:t>GPIO4</w:t>
+        <w:t>GPIO0</w:t>
       </w:r>
       <w:r>
         <w:rPr>
@@ -5847,7 +5854,21 @@
         <w:rPr>
           <w:lang w:val="es-AR"/>
         </w:rPr>
-        <w:t xml:space="preserve"> Salida PWM de 50 Hz asignada al servomotor de la Muñeca. </w:t>
+        <w:t xml:space="preserve"> Entrada digital con resistencia de </w:t>
+      </w:r>
+      <w:r>
+        <w:rPr>
+          <w:i/>
+          <w:iCs/>
+          <w:lang w:val="es-AR"/>
+        </w:rPr>
+        <w:t xml:space="preserve">pull-up</w:t>
+      </w:r>
+      <w:r>
+        <w:rPr>
+          <w:lang w:val="es-AR"/>
+        </w:rPr>
+        <w:t xml:space="preserve"> para el pulsador de apertura/cierre de la pinza. </w:t>
       </w:r>
     </w:p>
     <w:p>
@@ -5909,7 +5930,7 @@
           <w:noProof w:val="0"/>
           <w:lang w:val="es-AR"/>
         </w:rPr>
-        <w:t xml:space="preserve">En el presente diseño esquemático preliminar, las señales de control de los cinco servomotores se asignaron a los pines de propósito general GPIO1 a GPIO4 y GPIO8 del conector P2 para mantener agrupadas las salidas digitales en un único bloque. No obstante, para la etapa de desarrollo de </w:t>
+        <w:t xml:space="preserve">Las cuatro salidas de modulación de los ejes del brazo se asignaron al conector P1, que es donde el módulo sapi_servo de la biblioteca de la cátedra mapea sus salidas por defecto, y la de la pinza al pin 40 del conector P2. Con ese reparto no hace falta redefinir el mapa de pines interno del driver ni migrar las conexiones físicas en la etapa de integración.</w:t>
       </w:r>
       <w:r>
         <w:rPr>
@@ -5919,7 +5940,7 @@
           <w:noProof w:val="0"/>
           <w:lang w:val="es-AR"/>
         </w:rPr>
-        <w:t xml:space="preserve">firmware</w:t>
+        <w:t xml:space="preserve"/>
       </w:r>
       <w:r>
         <w:rPr>
@@ -5927,7 +5948,7 @@
           <w:noProof w:val="0"/>
           <w:lang w:val="es-AR"/>
         </w:rPr>
-        <w:t xml:space="preserve"> se prevé la utilización del módulo sapi_servo provisto por la biblioteca proporcionada por la cátedra. Dado que dicha biblioteca implementa el control de servos mediante interrupciones de temporizador con un mapeo de pines predeterminado (principalmente sobre las líneas T_FILx y T_COLx del conector P1), en la fase de integración de </w:t>
+        <w:t xml:space="preserve"/>
       </w:r>
       <w:r>
         <w:rPr>
@@ -5937,7 +5958,7 @@
           <w:noProof w:val="0"/>
           <w:lang w:val="es-AR"/>
         </w:rPr>
-        <w:t xml:space="preserve">software</w:t>
+        <w:t xml:space="preserve"/>
       </w:r>
       <w:r>
         <w:rPr>
@@ -5945,7 +5966,7 @@
           <w:noProof w:val="0"/>
           <w:lang w:val="es-AR"/>
         </w:rPr>
-        <w:t xml:space="preserve"> se evaluará si redefinir el mapa de pines interno del </w:t>
+        <w:t xml:space="preserve"/>
       </w:r>
       <w:r>
         <w:rPr>
@@ -5955,7 +5976,7 @@
           <w:noProof w:val="0"/>
           <w:lang w:val="es-AR"/>
         </w:rPr>
-        <w:t xml:space="preserve">driver</w:t>
+        <w:t xml:space="preserve"/>
       </w:r>
       <w:r>
         <w:rPr>
@@ -5963,7 +5984,7 @@
           <w:noProof w:val="0"/>
           <w:lang w:val="es-AR"/>
         </w:rPr>
-        <w:t xml:space="preserve"> para mantener las salidas en P2 o bien migrar las conexiones físicas a los pines por defecto de sAPI.</w:t>
+        <w:t xml:space="preserve"/>
       </w:r>
     </w:p>
     <w:p>
@@ -6224,7 +6245,7 @@
           <w:noProof w:val="0"/>
           <w:lang w:val="es-AR"/>
         </w:rPr>
-        <w:t xml:space="preserve"> (o amarillo). Entrada de la señal digital modulada generada por las salidas de la tira P2 de la EDU-CIAA.</w:t>
+        <w:t xml:space="preserve"> (o amarillo). Entrada de la señal digital modulada generada por la EDU-CIAA.</w:t>
       </w:r>
     </w:p>
     <w:p>
@@ -6827,6 +6848,22 @@
           <w:lang w:val="es-AR"/>
         </w:rPr>
         <w:t>La transmisión por engranajes de la sección 3.7 es lo que permite prescindir de todo convertidor. Al reducir el par que cada servomotor debe entregar, el riel de +5 V alcanza con un 19 % de margen sobre el factor de seguridad: descontada la caída del cable, al servomotor llegan 4,89 V y el par disponible es de 9,52 kg·cm, frente a los 7,97 kg·cm que exige el hombro. Sin transmisión no alcanzaría ni alimentando a 6 V. Se evitan así el convertidor, su disipador, los 5 W que disiparía y el riesgo de que un preajuste corrido eleve la salida a 12 V y queme los cinco servomotores. La arquitectura completa se muestra en la Figura 3.</w:t>
+      </w:r>
+    </w:p>
+    <w:p>
+      <w:pPr>
+        <w:spacing w:after="120" w:line="360" w:lineRule="auto"/>
+        <w:ind w:firstLine="709"/>
+        <w:jc w:val="both"/>
+        <w:rPr>
+          <w:lang w:val="es-AR"/>
+        </w:rPr>
+      </w:pPr>
+      <w:r>
+        <w:rPr>
+          <w:lang w:val="es-AR"/>
+        </w:rPr>
+        <w:t>La placa EDU-CIAA-NXP y los mandos se alimentan del mismo riel de +5 V, con un par de cables propio desde el conector de la fuente: la placa consume unos 150 mA y los cuatro potenciómetros de 10 kΩ de los joysticks, menos de 1 mA, a los que se suman 200 mA de margen para agregados, lo que da 0,35 A. Separar los pares evita que los picos de los servomotores se vean como caídas en la alimentación de la placa, que podría reiniciarse. El riel debe entregar entonces 5,06 A en régimen, contra los más de 20 A que da el de cualquier fuente de computadora.</w:t>
       </w:r>
     </w:p>
     <w:p>
@@ -11027,7 +11064,7 @@
         <w:rPr>
           <w:lang w:val="es-AR"/>
         </w:rPr>
-        <w:t>La Tabla 8 detalla las tareas realizadas por cada integrante y las horas invertidas, según la bitácora individual del informe inicial. Las 52 horas se corresponden con las tres tareas que la Tabla 7 marca en curso, que suman 50 horas planificadas.</w:t>
+        <w:t>La Tabla 8 detalla las tareas realizadas por cada integrante y las horas invertidas, según la bitácora individual del informe inicial. Las 52 horas se corresponden con las tres tareas que la Tabla 7 marca en curso, que suman 50 horas planificadas. Las tareas restantes son las que esa misma tabla identifica como pendientes.</w:t>
       </w:r>
     </w:p>
     <w:tbl>
@@ -12411,6 +12448,42 @@
           <w:lang w:val="es-AR"/>
         </w:rPr>
         <w:t>[8] Hardware libre [artículo de enciclopedia]. Disponible en: https://es.wikipedia.org/wiki/Hardware_libre (visitado 29-9-2026).</w:t>
+      </w:r>
+    </w:p>
+    <w:p>
+      <w:pPr>
+        <w:spacing w:after="140" w:line="280" w:lineRule="auto"/>
+        <w:ind w:left="567" w:hanging="567"/>
+        <w:jc w:val="both"/>
+        <w:rPr>
+          <w:lang w:val="es-AR"/>
+        </w:rPr>
+      </w:pPr>
+      <w:r>
+        <w:rPr>
+          <w:sz w:val="22"/>
+          <w:szCs w:val="22"/>
+          <w:lang w:val="es-AR"/>
+        </w:rPr>
+        <w:t>[9] Altium. Altium Designer [portal del producto]. Disponible en: https://www.altium.com/es/altium-designer (visitado 3-10-2026).</w:t>
+      </w:r>
+    </w:p>
+    <w:p>
+      <w:pPr>
+        <w:spacing w:after="140" w:line="280" w:lineRule="auto"/>
+        <w:ind w:left="567" w:hanging="567"/>
+        <w:jc w:val="both"/>
+        <w:rPr>
+          <w:lang w:val="es-AR"/>
+        </w:rPr>
+      </w:pPr>
+      <w:r>
+        <w:rPr>
+          <w:sz w:val="22"/>
+          <w:szCs w:val="22"/>
+          <w:lang w:val="es-AR"/>
+        </w:rPr>
+        <w:t>[10] Labcenter Electronics. Proteus Design Suite — Schematic Capture [portal del producto]. Disponible en: https://www.labcenter.com/schematic/ (visitado 3-10-2026).</w:t>
       </w:r>
     </w:p>
     <w:p>
@@ -12517,6 +12590,985 @@
           <w:lang w:val="es-AR"/>
         </w:rPr>
         <w:t>Figura A.1. Circuito esquemático general de conexiones de la EDU-CIAA-NXP y periféricos.</w:t>
+      </w:r>
+    </w:p>
+    <w:p>
+      <w:pPr>
+        <w:pStyle w:val="heading10"/>
+        <w:keepNext/>
+        <w:pageBreakBefore/>
+        <w:spacing w:before="360" w:after="200" w:line="300" w:lineRule="auto"/>
+        <w:rPr>
+          <w:lang w:val="es-AR"/>
+        </w:rPr>
+      </w:pPr>
+      <w:r>
+        <w:rPr>
+          <w:lang w:val="es-AR"/>
+        </w:rPr>
+        <w:t>ANEXO B. DISEÑO DE CIRCUITOS ESQUEMÁTICOS</w:t>
+      </w:r>
+    </w:p>
+    <w:p>
+      <w:pPr>
+        <w:spacing w:after="140" w:line="360" w:lineRule="auto"/>
+        <w:ind w:firstLine="567"/>
+        <w:jc w:val="both"/>
+        <w:rPr>
+          <w:lang w:val="es-AR"/>
+        </w:rPr>
+      </w:pPr>
+      <w:r>
+        <w:rPr>
+          <w:lang w:val="es-AR"/>
+        </w:rPr>
+        <w:t>Las definiciones siguientes corresponden a KiCad [7], que es la herramienta adoptada, y se contrastaron con Altium Designer [9] y Proteus [10].</w:t>
+      </w:r>
+    </w:p>
+    <w:p>
+      <w:pPr>
+        <w:pStyle w:val="ListParagraph"/>
+        <w:numPr>
+          <w:ilvl w:val="0"/>
+          <w:numId w:val="1"/>
+        </w:numPr>
+        <w:spacing w:after="100" w:line="360" w:lineRule="auto"/>
+        <w:jc w:val="both"/>
+        <w:rPr>
+          <w:lang w:val="es-AR"/>
+        </w:rPr>
+      </w:pPr>
+      <w:r>
+        <w:rPr>
+          <w:b/>
+          <w:bCs/>
+          <w:lang w:val="es-AR"/>
+        </w:rPr>
+        <w:t>Parte:</w:t>
+      </w:r>
+      <w:r>
+        <w:rPr>
+          <w:rFonts w:ascii="Consolas" w:hAnsi="Consolas" w:eastAsia="Consolas" w:cs="Consolas"/>
+          <w:b/>
+          <w:bCs/>
+          <w:lang w:val="es-AR"/>
+        </w:rPr>
+        <w:t/>
+      </w:r>
+      <w:r>
+        <w:rPr>
+          <w:b/>
+          <w:bCs/>
+          <w:lang w:val="es-AR"/>
+        </w:rPr>
+        <w:t/>
+      </w:r>
+      <w:r>
+        <w:rPr>
+          <w:lang w:val="es-AR"/>
+        </w:rPr>
+        <w:t xml:space="preserve"> el dispositivo físico tal como se compra, identificado por su código de fabricante. El MG996R es una parte; el símbolo que lo representa en el plano es otra cosa.</w:t>
+      </w:r>
+    </w:p>
+    <w:p>
+      <w:pPr>
+        <w:pStyle w:val="ListParagraph"/>
+        <w:numPr>
+          <w:ilvl w:val="0"/>
+          <w:numId w:val="1"/>
+        </w:numPr>
+        <w:spacing w:after="100" w:line="360" w:lineRule="auto"/>
+        <w:jc w:val="both"/>
+        <w:rPr>
+          <w:lang w:val="es-AR"/>
+        </w:rPr>
+      </w:pPr>
+      <w:r>
+        <w:rPr>
+          <w:b/>
+          <w:bCs/>
+          <w:lang w:val="es-AR"/>
+        </w:rPr>
+        <w:t>Componente o símbolo:</w:t>
+      </w:r>
+      <w:r>
+        <w:rPr>
+          <w:rFonts w:ascii="Consolas" w:hAnsi="Consolas" w:eastAsia="Consolas" w:cs="Consolas"/>
+          <w:b/>
+          <w:bCs/>
+          <w:lang w:val="es-AR"/>
+        </w:rPr>
+        <w:t/>
+      </w:r>
+      <w:r>
+        <w:rPr>
+          <w:b/>
+          <w:bCs/>
+          <w:lang w:val="es-AR"/>
+        </w:rPr>
+        <w:t/>
+      </w:r>
+      <w:r>
+        <w:rPr>
+          <w:lang w:val="es-AR"/>
+        </w:rPr>
+        <w:t xml:space="preserve"> el dibujo que representa a la parte en el esquemático, con sus pines. Define conectividad, no geometría: el mismo símbolo sirve para encapsulados distintos.</w:t>
+      </w:r>
+    </w:p>
+    <w:p>
+      <w:pPr>
+        <w:pStyle w:val="ListParagraph"/>
+        <w:numPr>
+          <w:ilvl w:val="0"/>
+          <w:numId w:val="1"/>
+        </w:numPr>
+        <w:spacing w:after="100" w:line="360" w:lineRule="auto"/>
+        <w:jc w:val="both"/>
+        <w:rPr>
+          <w:lang w:val="es-AR"/>
+        </w:rPr>
+      </w:pPr>
+      <w:r>
+        <w:rPr>
+          <w:b/>
+          <w:bCs/>
+          <w:lang w:val="es-AR"/>
+        </w:rPr>
+        <w:t>Referencia:</w:t>
+      </w:r>
+      <w:r>
+        <w:rPr>
+          <w:rFonts w:ascii="Consolas" w:hAnsi="Consolas" w:eastAsia="Consolas" w:cs="Consolas"/>
+          <w:b/>
+          <w:bCs/>
+          <w:lang w:val="es-AR"/>
+        </w:rPr>
+        <w:t/>
+      </w:r>
+      <w:r>
+        <w:rPr>
+          <w:b/>
+          <w:bCs/>
+          <w:lang w:val="es-AR"/>
+        </w:rPr>
+        <w:t/>
+      </w:r>
+      <w:r>
+        <w:rPr>
+          <w:lang w:val="es-AR"/>
+        </w:rPr>
+        <w:t xml:space="preserve"> el identificador único de cada instancia en la hoja —P1, C1, F1, J_SERVO1—, formado por un prefijo según el tipo y un número. Es el nexo entre el esquemático, el circuito impreso y la lista de materiales.</w:t>
+      </w:r>
+    </w:p>
+    <w:p>
+      <w:pPr>
+        <w:pStyle w:val="ListParagraph"/>
+        <w:numPr>
+          <w:ilvl w:val="0"/>
+          <w:numId w:val="1"/>
+        </w:numPr>
+        <w:spacing w:after="100" w:line="360" w:lineRule="auto"/>
+        <w:jc w:val="both"/>
+        <w:rPr>
+          <w:lang w:val="es-AR"/>
+        </w:rPr>
+      </w:pPr>
+      <w:r>
+        <w:rPr>
+          <w:b/>
+          <w:bCs/>
+          <w:lang w:val="es-AR"/>
+        </w:rPr>
+        <w:t>Valor:</w:t>
+      </w:r>
+      <w:r>
+        <w:rPr>
+          <w:rFonts w:ascii="Consolas" w:hAnsi="Consolas" w:eastAsia="Consolas" w:cs="Consolas"/>
+          <w:b/>
+          <w:bCs/>
+          <w:lang w:val="es-AR"/>
+        </w:rPr>
+        <w:t/>
+      </w:r>
+      <w:r>
+        <w:rPr>
+          <w:b/>
+          <w:bCs/>
+          <w:lang w:val="es-AR"/>
+        </w:rPr>
+        <w:t/>
+      </w:r>
+      <w:r>
+        <w:rPr>
+          <w:lang w:val="es-AR"/>
+        </w:rPr>
+        <w:t xml:space="preserve"> la característica que distingue funcionalmente a esa instancia: 2200 µF 16 V en C1, 8 A en F1, MG996R en los servomotores.</w:t>
+      </w:r>
+    </w:p>
+    <w:p>
+      <w:pPr>
+        <w:pStyle w:val="ListParagraph"/>
+        <w:numPr>
+          <w:ilvl w:val="0"/>
+          <w:numId w:val="1"/>
+        </w:numPr>
+        <w:spacing w:after="100" w:line="360" w:lineRule="auto"/>
+        <w:jc w:val="both"/>
+        <w:rPr>
+          <w:lang w:val="es-AR"/>
+        </w:rPr>
+      </w:pPr>
+      <w:r>
+        <w:rPr>
+          <w:b/>
+          <w:bCs/>
+          <w:lang w:val="es-AR"/>
+        </w:rPr>
+        <w:t>Pin:</w:t>
+      </w:r>
+      <w:r>
+        <w:rPr>
+          <w:rFonts w:ascii="Consolas" w:hAnsi="Consolas" w:eastAsia="Consolas" w:cs="Consolas"/>
+          <w:b/>
+          <w:bCs/>
+          <w:lang w:val="es-AR"/>
+        </w:rPr>
+        <w:t/>
+      </w:r>
+      <w:r>
+        <w:rPr>
+          <w:b/>
+          <w:bCs/>
+          <w:lang w:val="es-AR"/>
+        </w:rPr>
+        <w:t/>
+      </w:r>
+      <w:r>
+        <w:rPr>
+          <w:lang w:val="es-AR"/>
+        </w:rPr>
+        <w:t xml:space="preserve"> cada terminal eléctrico del símbolo. Lleva número, que es su posición física en el encapsulado; nombre, que es su función; y tipo eléctrico —entrada, salida, pasivo, alimentación, no conectado—, que es lo que usa el analizador de errores.</w:t>
+      </w:r>
+    </w:p>
+    <w:p>
+      <w:pPr>
+        <w:pStyle w:val="ListParagraph"/>
+        <w:numPr>
+          <w:ilvl w:val="0"/>
+          <w:numId w:val="1"/>
+        </w:numPr>
+        <w:spacing w:after="100" w:line="360" w:lineRule="auto"/>
+        <w:jc w:val="both"/>
+        <w:rPr>
+          <w:lang w:val="es-AR"/>
+        </w:rPr>
+      </w:pPr>
+      <w:r>
+        <w:rPr>
+          <w:b/>
+          <w:bCs/>
+          <w:lang w:val="es-AR"/>
+        </w:rPr>
+        <w:t>Cable:</w:t>
+      </w:r>
+      <w:r>
+        <w:rPr>
+          <w:rFonts w:ascii="Consolas" w:hAnsi="Consolas" w:eastAsia="Consolas" w:cs="Consolas"/>
+          <w:b/>
+          <w:bCs/>
+          <w:lang w:val="es-AR"/>
+        </w:rPr>
+        <w:t/>
+      </w:r>
+      <w:r>
+        <w:rPr>
+          <w:b/>
+          <w:bCs/>
+          <w:lang w:val="es-AR"/>
+        </w:rPr>
+        <w:t/>
+      </w:r>
+      <w:r>
+        <w:rPr>
+          <w:lang w:val="es-AR"/>
+        </w:rPr>
+        <w:t xml:space="preserve"> la línea que une dos pines y establece la conexión eléctrica. Dos cables que se cruzan sin punto de unión no están conectados.</w:t>
+      </w:r>
+    </w:p>
+    <w:p>
+      <w:pPr>
+        <w:pStyle w:val="ListParagraph"/>
+        <w:numPr>
+          <w:ilvl w:val="0"/>
+          <w:numId w:val="1"/>
+        </w:numPr>
+        <w:spacing w:after="100" w:line="360" w:lineRule="auto"/>
+        <w:jc w:val="both"/>
+        <w:rPr>
+          <w:lang w:val="es-AR"/>
+        </w:rPr>
+      </w:pPr>
+      <w:r>
+        <w:rPr>
+          <w:b/>
+          <w:bCs/>
+          <w:lang w:val="es-AR"/>
+        </w:rPr>
+        <w:t>Bus:</w:t>
+      </w:r>
+      <w:r>
+        <w:rPr>
+          <w:rFonts w:ascii="Consolas" w:hAnsi="Consolas" w:eastAsia="Consolas" w:cs="Consolas"/>
+          <w:b/>
+          <w:bCs/>
+          <w:lang w:val="es-AR"/>
+        </w:rPr>
+        <w:t/>
+      </w:r>
+      <w:r>
+        <w:rPr>
+          <w:b/>
+          <w:bCs/>
+          <w:lang w:val="es-AR"/>
+        </w:rPr>
+        <w:t/>
+      </w:r>
+      <w:r>
+        <w:rPr>
+          <w:lang w:val="es-AR"/>
+        </w:rPr>
+        <w:t xml:space="preserve"> varias señales relacionadas dibujadas como una sola línea gruesa y nombradas en conjunto, por ejemplo D[0..7], para no trazar decenas de líneas paralelas.</w:t>
+      </w:r>
+    </w:p>
+    <w:p>
+      <w:pPr>
+        <w:pStyle w:val="ListParagraph"/>
+        <w:numPr>
+          <w:ilvl w:val="0"/>
+          <w:numId w:val="1"/>
+        </w:numPr>
+        <w:spacing w:after="100" w:line="360" w:lineRule="auto"/>
+        <w:jc w:val="both"/>
+        <w:rPr>
+          <w:lang w:val="es-AR"/>
+        </w:rPr>
+      </w:pPr>
+      <w:r>
+        <w:rPr>
+          <w:b/>
+          <w:bCs/>
+          <w:lang w:val="es-AR"/>
+        </w:rPr>
+        <w:t>No conexión:</w:t>
+      </w:r>
+      <w:r>
+        <w:rPr>
+          <w:rFonts w:ascii="Consolas" w:hAnsi="Consolas" w:eastAsia="Consolas" w:cs="Consolas"/>
+          <w:b/>
+          <w:bCs/>
+          <w:lang w:val="es-AR"/>
+        </w:rPr>
+        <w:t/>
+      </w:r>
+      <w:r>
+        <w:rPr>
+          <w:b/>
+          <w:bCs/>
+          <w:lang w:val="es-AR"/>
+        </w:rPr>
+        <w:t/>
+      </w:r>
+      <w:r>
+        <w:rPr>
+          <w:lang w:val="es-AR"/>
+        </w:rPr>
+        <w:t xml:space="preserve"> la cruz que se coloca sobre un pin que se deja deliberadamente sin usar, para que el analizador de errores no lo informe como falta. En el esquemático del proyecto marca los pines libres de P1 y P2.</w:t>
+      </w:r>
+    </w:p>
+    <w:p>
+      <w:pPr>
+        <w:pStyle w:val="ListParagraph"/>
+        <w:numPr>
+          <w:ilvl w:val="0"/>
+          <w:numId w:val="1"/>
+        </w:numPr>
+        <w:spacing w:after="100" w:line="360" w:lineRule="auto"/>
+        <w:jc w:val="both"/>
+        <w:rPr>
+          <w:lang w:val="es-AR"/>
+        </w:rPr>
+      </w:pPr>
+      <w:r>
+        <w:rPr>
+          <w:b/>
+          <w:bCs/>
+          <w:lang w:val="es-AR"/>
+        </w:rPr>
+        <w:t>Etiquetas:</w:t>
+      </w:r>
+      <w:r>
+        <w:rPr>
+          <w:rFonts w:ascii="Consolas" w:hAnsi="Consolas" w:eastAsia="Consolas" w:cs="Consolas"/>
+          <w:b/>
+          <w:bCs/>
+          <w:lang w:val="es-AR"/>
+        </w:rPr>
+        <w:t/>
+      </w:r>
+      <w:r>
+        <w:rPr>
+          <w:b/>
+          <w:bCs/>
+          <w:lang w:val="es-AR"/>
+        </w:rPr>
+        <w:t/>
+      </w:r>
+      <w:r>
+        <w:rPr>
+          <w:lang w:val="es-AR"/>
+        </w:rPr>
+        <w:t xml:space="preserve"> nombres asignados a un cable. Dos cables con la misma etiqueta quedan conectados aunque no se dibuje el trazo entre ellos; las locales valen dentro de una hoja y las globales en todo el diseño. PWM_BASE y JOY_A_X son etiquetas.</w:t>
+      </w:r>
+    </w:p>
+    <w:p>
+      <w:pPr>
+        <w:pStyle w:val="ListParagraph"/>
+        <w:numPr>
+          <w:ilvl w:val="0"/>
+          <w:numId w:val="1"/>
+        </w:numPr>
+        <w:spacing w:after="100" w:line="360" w:lineRule="auto"/>
+        <w:jc w:val="both"/>
+        <w:rPr>
+          <w:lang w:val="es-AR"/>
+        </w:rPr>
+      </w:pPr>
+      <w:r>
+        <w:rPr>
+          <w:b/>
+          <w:bCs/>
+          <w:lang w:val="es-AR"/>
+        </w:rPr>
+        <w:t>Puertos:</w:t>
+      </w:r>
+      <w:r>
+        <w:rPr>
+          <w:rFonts w:ascii="Consolas" w:hAnsi="Consolas" w:eastAsia="Consolas" w:cs="Consolas"/>
+          <w:b/>
+          <w:bCs/>
+          <w:lang w:val="es-AR"/>
+        </w:rPr>
+        <w:t/>
+      </w:r>
+      <w:r>
+        <w:rPr>
+          <w:b/>
+          <w:bCs/>
+          <w:lang w:val="es-AR"/>
+        </w:rPr>
+        <w:t/>
+      </w:r>
+      <w:r>
+        <w:rPr>
+          <w:lang w:val="es-AR"/>
+        </w:rPr>
+        <w:t xml:space="preserve"> los puntos de entrada y salida de una hoja jerárquica, que vinculan una señal interna con la hoja que la contiene.</w:t>
+      </w:r>
+    </w:p>
+    <w:p>
+      <w:pPr>
+        <w:pStyle w:val="ListParagraph"/>
+        <w:numPr>
+          <w:ilvl w:val="0"/>
+          <w:numId w:val="1"/>
+        </w:numPr>
+        <w:spacing w:after="100" w:line="360" w:lineRule="auto"/>
+        <w:jc w:val="both"/>
+        <w:rPr>
+          <w:lang w:val="es-AR"/>
+        </w:rPr>
+      </w:pPr>
+      <w:r>
+        <w:rPr>
+          <w:b/>
+          <w:bCs/>
+          <w:lang w:val="es-AR"/>
+        </w:rPr>
+        <w:t>Analizador de errores (ERC):</w:t>
+      </w:r>
+      <w:r>
+        <w:rPr>
+          <w:rFonts w:ascii="Consolas" w:hAnsi="Consolas" w:eastAsia="Consolas" w:cs="Consolas"/>
+          <w:b/>
+          <w:bCs/>
+          <w:lang w:val="es-AR"/>
+        </w:rPr>
+        <w:t/>
+      </w:r>
+      <w:r>
+        <w:rPr>
+          <w:b/>
+          <w:bCs/>
+          <w:lang w:val="es-AR"/>
+        </w:rPr>
+        <w:t/>
+      </w:r>
+      <w:r>
+        <w:rPr>
+          <w:lang w:val="es-AR"/>
+        </w:rPr>
+        <w:t xml:space="preserve"> la comprobación automática de incoherencias eléctricas: pines sin conectar, dos salidas enfrentadas, pines de alimentación sin fuente. Verifica que el plano sea formalmente consistente, no que el diseño sea correcto.</w:t>
+      </w:r>
+    </w:p>
+    <w:p>
+      <w:pPr>
+        <w:pStyle w:val="ListParagraph"/>
+        <w:numPr>
+          <w:ilvl w:val="0"/>
+          <w:numId w:val="1"/>
+        </w:numPr>
+        <w:spacing w:after="100" w:line="360" w:lineRule="auto"/>
+        <w:jc w:val="both"/>
+        <w:rPr>
+          <w:lang w:val="es-AR"/>
+        </w:rPr>
+      </w:pPr>
+      <w:r>
+        <w:rPr>
+          <w:b/>
+          <w:bCs/>
+          <w:i/>
+          <w:iCs/>
+          <w:lang w:val="es-AR"/>
+        </w:rPr>
+        <w:t xml:space="preserve">Netlist</w:t>
+      </w:r>
+      <w:r>
+        <w:rPr>
+          <w:b/>
+          <w:bCs/>
+          <w:lang w:val="es-AR"/>
+        </w:rPr>
+        <w:t xml:space="preserve">:</w:t>
+      </w:r>
+      <w:r>
+        <w:rPr>
+          <w:rFonts w:ascii="Consolas" w:hAnsi="Consolas" w:eastAsia="Consolas" w:cs="Consolas"/>
+          <w:b/>
+          <w:bCs/>
+          <w:lang w:val="es-AR"/>
+        </w:rPr>
+        <w:t/>
+      </w:r>
+      <w:r>
+        <w:rPr>
+          <w:b/>
+          <w:bCs/>
+          <w:lang w:val="es-AR"/>
+        </w:rPr>
+        <w:t/>
+      </w:r>
+      <w:r>
+        <w:rPr>
+          <w:lang w:val="es-AR"/>
+        </w:rPr>
+        <w:t xml:space="preserve"> la lista de nodos eléctricos y de los pines que llegan a cada uno. Es la conectividad del esquemático en texto, y es lo que recibe el editor de circuito impreso.</w:t>
+      </w:r>
+    </w:p>
+    <w:p>
+      <w:pPr>
+        <w:pStyle w:val="ListParagraph"/>
+        <w:numPr>
+          <w:ilvl w:val="0"/>
+          <w:numId w:val="1"/>
+        </w:numPr>
+        <w:spacing w:after="100" w:line="360" w:lineRule="auto"/>
+        <w:jc w:val="both"/>
+        <w:rPr>
+          <w:lang w:val="es-AR"/>
+        </w:rPr>
+      </w:pPr>
+      <w:r>
+        <w:rPr>
+          <w:b/>
+          <w:bCs/>
+          <w:lang w:val="es-AR"/>
+        </w:rPr>
+        <w:t>Lista de materiales (BOM):</w:t>
+      </w:r>
+      <w:r>
+        <w:rPr>
+          <w:rFonts w:ascii="Consolas" w:hAnsi="Consolas" w:eastAsia="Consolas" w:cs="Consolas"/>
+          <w:b/>
+          <w:bCs/>
+          <w:lang w:val="es-AR"/>
+        </w:rPr>
+        <w:t/>
+      </w:r>
+      <w:r>
+        <w:rPr>
+          <w:b/>
+          <w:bCs/>
+          <w:lang w:val="es-AR"/>
+        </w:rPr>
+        <w:t/>
+      </w:r>
+      <w:r>
+        <w:rPr>
+          <w:lang w:val="es-AR"/>
+        </w:rPr>
+        <w:t xml:space="preserve"> el listado de componentes con referencia, valor, cantidad y código de parte, generado a partir del esquemático. Es lo que se compra.</w:t>
+      </w:r>
+    </w:p>
+    <w:p>
+      <w:pPr>
+        <w:pStyle w:val="ListParagraph"/>
+        <w:numPr>
+          <w:ilvl w:val="0"/>
+          <w:numId w:val="1"/>
+        </w:numPr>
+        <w:spacing w:after="100" w:line="360" w:lineRule="auto"/>
+        <w:jc w:val="both"/>
+        <w:rPr>
+          <w:lang w:val="es-AR"/>
+        </w:rPr>
+      </w:pPr>
+      <w:r>
+        <w:rPr>
+          <w:b/>
+          <w:bCs/>
+          <w:lang w:val="es-AR"/>
+        </w:rPr>
+        <w:t>Grilla:</w:t>
+      </w:r>
+      <w:r>
+        <w:rPr>
+          <w:rFonts w:ascii="Consolas" w:hAnsi="Consolas" w:eastAsia="Consolas" w:cs="Consolas"/>
+          <w:b/>
+          <w:bCs/>
+          <w:lang w:val="es-AR"/>
+        </w:rPr>
+        <w:t/>
+      </w:r>
+      <w:r>
+        <w:rPr>
+          <w:b/>
+          <w:bCs/>
+          <w:lang w:val="es-AR"/>
+        </w:rPr>
+        <w:t/>
+      </w:r>
+      <w:r>
+        <w:rPr>
+          <w:lang w:val="es-AR"/>
+        </w:rPr>
+        <w:t xml:space="preserve"> la malla a la que se ajusta el cursor. Los pines de los símbolos se dibujan sobre la grilla —1,27 mm en KiCad— para que los cables conecten exactamente; fuera de grilla, un cable que parece unido no lo está.</w:t>
+      </w:r>
+    </w:p>
+    <w:p>
+      <w:pPr>
+        <w:pStyle w:val="ListParagraph"/>
+        <w:numPr>
+          <w:ilvl w:val="0"/>
+          <w:numId w:val="1"/>
+        </w:numPr>
+        <w:spacing w:after="100" w:line="360" w:lineRule="auto"/>
+        <w:jc w:val="both"/>
+        <w:rPr>
+          <w:lang w:val="es-AR"/>
+        </w:rPr>
+      </w:pPr>
+      <w:r>
+        <w:rPr>
+          <w:b/>
+          <w:bCs/>
+          <w:lang w:val="es-AR"/>
+        </w:rPr>
+        <w:t>Hoja jerárquica:</w:t>
+      </w:r>
+      <w:r>
+        <w:rPr>
+          <w:rFonts w:ascii="Consolas" w:hAnsi="Consolas" w:eastAsia="Consolas" w:cs="Consolas"/>
+          <w:b/>
+          <w:bCs/>
+          <w:lang w:val="es-AR"/>
+        </w:rPr>
+        <w:t/>
+      </w:r>
+      <w:r>
+        <w:rPr>
+          <w:b/>
+          <w:bCs/>
+          <w:lang w:val="es-AR"/>
+        </w:rPr>
+        <w:t/>
+      </w:r>
+      <w:r>
+        <w:rPr>
+          <w:lang w:val="es-AR"/>
+        </w:rPr>
+        <w:t xml:space="preserve"> una subhoja que se inserta en la principal como un bloque con sus puertos, para partir un diseño grande. El de este proyecto entra en una sola hoja y no la necesita.</w:t>
+      </w:r>
+    </w:p>
+    <w:p>
+      <w:pPr>
+        <w:pStyle w:val="ListParagraph"/>
+        <w:numPr>
+          <w:ilvl w:val="0"/>
+          <w:numId w:val="1"/>
+        </w:numPr>
+        <w:spacing w:after="100" w:line="360" w:lineRule="auto"/>
+        <w:jc w:val="both"/>
+        <w:rPr>
+          <w:lang w:val="es-AR"/>
+        </w:rPr>
+      </w:pPr>
+      <w:r>
+        <w:rPr>
+          <w:b/>
+          <w:bCs/>
+          <w:lang w:val="es-AR"/>
+        </w:rPr>
+        <w:t xml:space="preserve">Huella o </w:t>
+      </w:r>
+      <w:r>
+        <w:rPr>
+          <w:b/>
+          <w:bCs/>
+          <w:i/>
+          <w:iCs/>
+          <w:lang w:val="es-AR"/>
+        </w:rPr>
+        <w:t xml:space="preserve">footprint</w:t>
+      </w:r>
+      <w:r>
+        <w:rPr>
+          <w:b/>
+          <w:bCs/>
+          <w:lang w:val="es-AR"/>
+        </w:rPr>
+        <w:t xml:space="preserve">:</w:t>
+      </w:r>
+      <w:r>
+        <w:rPr>
+          <w:rFonts w:ascii="Consolas" w:hAnsi="Consolas" w:eastAsia="Consolas" w:cs="Consolas"/>
+          <w:b/>
+          <w:bCs/>
+          <w:lang w:val="es-AR"/>
+        </w:rPr>
+        <w:t/>
+      </w:r>
+      <w:r>
+        <w:rPr>
+          <w:b/>
+          <w:bCs/>
+          <w:lang w:val="es-AR"/>
+        </w:rPr>
+        <w:t/>
+      </w:r>
+      <w:r>
+        <w:rPr>
+          <w:lang w:val="es-AR"/>
+        </w:rPr>
+        <w:t xml:space="preserve"> el patrón físico que el componente ocupa en el circuito impreso: islas, dimensiones, perforaciones y serigrafía. El símbolo aporta la conectividad y la huella, la geometría.</w:t>
+      </w:r>
+    </w:p>
+    <w:p>
+      <w:pPr>
+        <w:pStyle w:val="ListParagraph"/>
+        <w:numPr>
+          <w:ilvl w:val="0"/>
+          <w:numId w:val="1"/>
+        </w:numPr>
+        <w:spacing w:after="100" w:line="360" w:lineRule="auto"/>
+        <w:jc w:val="both"/>
+        <w:rPr>
+          <w:lang w:val="es-AR"/>
+        </w:rPr>
+      </w:pPr>
+      <w:r>
+        <w:rPr>
+          <w:b/>
+          <w:bCs/>
+          <w:lang w:val="es-AR"/>
+        </w:rPr>
+        <w:t xml:space="preserve">Encapsulado o </w:t>
+      </w:r>
+      <w:r>
+        <w:rPr>
+          <w:b/>
+          <w:bCs/>
+          <w:i/>
+          <w:iCs/>
+          <w:lang w:val="es-AR"/>
+        </w:rPr>
+        <w:t xml:space="preserve">package</w:t>
+      </w:r>
+      <w:r>
+        <w:rPr>
+          <w:b/>
+          <w:bCs/>
+          <w:lang w:val="es-AR"/>
+        </w:rPr>
+        <w:t xml:space="preserve">:</w:t>
+      </w:r>
+      <w:r>
+        <w:rPr>
+          <w:rFonts w:ascii="Consolas" w:hAnsi="Consolas" w:eastAsia="Consolas" w:cs="Consolas"/>
+          <w:b/>
+          <w:bCs/>
+          <w:lang w:val="es-AR"/>
+        </w:rPr>
+        <w:t/>
+      </w:r>
+      <w:r>
+        <w:rPr>
+          <w:b/>
+          <w:bCs/>
+          <w:lang w:val="es-AR"/>
+        </w:rPr>
+        <w:t/>
+      </w:r>
+      <w:r>
+        <w:rPr>
+          <w:lang w:val="es-AR"/>
+        </w:rPr>
+        <w:t xml:space="preserve"> el formato físico normalizado del componente: DIP-8, SOT-23, 0805, THT. La huella es el dibujo de ese encapsulado sobre la placa.</w:t>
+      </w:r>
+    </w:p>
+    <w:p>
+      <w:pPr>
+        <w:pStyle w:val="ListParagraph"/>
+        <w:numPr>
+          <w:ilvl w:val="0"/>
+          <w:numId w:val="1"/>
+        </w:numPr>
+        <w:spacing w:after="100" w:line="360" w:lineRule="auto"/>
+        <w:jc w:val="both"/>
+        <w:rPr>
+          <w:lang w:val="es-AR"/>
+        </w:rPr>
+      </w:pPr>
+      <w:r>
+        <w:rPr>
+          <w:b/>
+          <w:bCs/>
+          <w:lang w:val="es-AR"/>
+        </w:rPr>
+        <w:t>Modelo 3D:</w:t>
+      </w:r>
+      <w:r>
+        <w:rPr>
+          <w:rFonts w:ascii="Consolas" w:hAnsi="Consolas" w:eastAsia="Consolas" w:cs="Consolas"/>
+          <w:b/>
+          <w:bCs/>
+          <w:lang w:val="es-AR"/>
+        </w:rPr>
+        <w:t/>
+      </w:r>
+      <w:r>
+        <w:rPr>
+          <w:b/>
+          <w:bCs/>
+          <w:lang w:val="es-AR"/>
+        </w:rPr>
+        <w:t/>
+      </w:r>
+      <w:r>
+        <w:rPr>
+          <w:lang w:val="es-AR"/>
+        </w:rPr>
+        <w:t xml:space="preserve"> la representación tridimensional asociada a la huella. Permite ver la placa terminada y detectar interferencias mecánicas con el gabinete antes de fabricarla.</w:t>
+      </w:r>
+    </w:p>
+    <w:p>
+      <w:pPr>
+        <w:spacing w:after="140" w:line="360" w:lineRule="auto"/>
+        <w:ind w:firstLine="567"/>
+        <w:jc w:val="both"/>
+        <w:rPr>
+          <w:lang w:val="es-AR"/>
+        </w:rPr>
+      </w:pPr>
+      <w:r>
+        <w:rPr>
+          <w:lang w:val="es-AR"/>
+        </w:rPr>
+        <w:t xml:space="preserve">Los tres entornos comparten el modelo de trabajo y difieren sobre todo en el nombre: lo que KiCad separa en símbolo y huella, Altium Designer lo agrupa en un componente con sus modelos asociados, y Proteus distingue la captura del esquemático del diseño de la placa, donde la huella aparece como </w:t>
+      </w:r>
+      <w:r>
+        <w:rPr>
+          <w:i/>
+          <w:iCs/>
+          <w:lang w:val="es-AR"/>
+        </w:rPr>
+        <w:t xml:space="preserve">package</w:t>
+      </w:r>
+      <w:r>
+        <w:rPr>
+          <w:lang w:val="es-AR"/>
+        </w:rPr>
+        <w:t xml:space="preserve">.</w:t>
+      </w:r>
+    </w:p>
+    <w:p>
+      <w:pPr>
+        <w:spacing w:after="140" w:line="360" w:lineRule="auto"/>
+        <w:ind w:firstLine="567"/>
+        <w:jc w:val="both"/>
+        <w:rPr>
+          <w:lang w:val="es-AR"/>
+        </w:rPr>
+      </w:pPr>
+      <w:r>
+        <w:rPr>
+          <w:lang w:val="es-AR"/>
+        </w:rPr>
+        <w:t xml:space="preserve">Cuando un componente no existe en las bibliotecas instaladas hay que dibujar su símbolo en el editor de símbolos. El procedimiento en KiCad es crear una biblioteca propia del proyecto, agregar en ella un símbolo nuevo con su prefijo de referencia y su valor, dibujar el cuerpo y colgarle los pines uno por uno, indicando para cada uno el número, que es su posición física en el encapsulado; el nombre, que es su función; y el tipo eléctrico, que es lo que usa el analizador de errores. Por último se le asocia una huella, y recién entonces el símbolo puede colocarse en la hoja.</w:t>
+      </w:r>
+      <w:r>
+        <w:rPr>
+          <w:i/>
+          <w:iCs/>
+          <w:lang w:val="es-AR"/>
+        </w:rPr>
+        <w:t xml:space="preserve"/>
+      </w:r>
+      <w:r>
+        <w:rPr>
+          <w:lang w:val="es-AR"/>
+        </w:rPr>
+        <w:t xml:space="preserve"/>
+      </w:r>
+    </w:p>
+    <w:p>
+      <w:pPr>
+        <w:spacing w:after="140" w:line="360" w:lineRule="auto"/>
+        <w:ind w:firstLine="567"/>
+        <w:jc w:val="both"/>
+        <w:rPr>
+          <w:lang w:val="es-AR"/>
+        </w:rPr>
+      </w:pPr>
+      <w:r>
+        <w:rPr>
+          <w:lang w:val="es-AR"/>
+        </w:rPr>
+        <w:t xml:space="preserve">En este esquemático no fue necesario: los símbolos utilizados —los conectores de 40, 5 y 3 vías, el pulsador, el capacitor y el fusible— están en las bibliotecas estándar de KiCad. El caso en que sí haría falta es un símbolo propio de la EDU-CIAA-NXP: hoy P1 y P2 se representan con un conector genérico cuyos pines solo llevan número, de modo que la función de cada uno queda en el texto de la sección 3.5 y no en el plano. Un símbolo con los nombres reales haría el esquemático legible por sí mismo y permitiría que el analizador de errores verificara los tipos de pin.</w:t>
+      </w:r>
+      <w:r>
+        <w:rPr>
+          <w:i/>
+          <w:iCs/>
+          <w:lang w:val="es-AR"/>
+        </w:rPr>
+        <w:t xml:space="preserve"/>
+      </w:r>
+      <w:r>
+        <w:rPr>
+          <w:lang w:val="es-AR"/>
+        </w:rPr>
+        <w:t xml:space="preserve"/>
       </w:r>
     </w:p>
     <w:sectPr>

</xml_diff>

<commit_message>
Documento listo y cosas para hacer luego de examenes
</commit_message>
<xml_diff>
--- a/Informe_de_avance/Informe_Avance_1.docx
+++ b/Informe_de_avance/Informe_Avance_1.docx
@@ -4044,7 +4044,7 @@
         <w:rPr>
           <w:lang w:val="es-AR"/>
         </w:rPr>
-        <w:t>Se adoptan dos módulos de joystick de dos ejes y un pulsador para la pinza, que solo necesita dos estados. Tres de los cuatro ejes analógicos comandan la base, el hombro y el codo; la muñeca no se comanda, porque el firmware calcula su ángulo a partir de los del hombro y el codo para mantener el recipiente vertical (sección 4.3). El cuarto eje queda cableado y sin asignar, como reserva para un ajuste fino de la muñeca. La asignación se muestra en la Figura 2.</w:t>
+        <w:t>Se adoptan dos módulos de joystick de dos ejes y un pulsador para la pinza, que solo necesita dos estados. Tres de los cuatro ejes analógicos comandan la base, el hombro y el codo; la muñeca no se comanda, porque el firmware calcula su ángulo a partir de los del hombro y el codo para mantener el recipiente vertical (sección 4.3). El cuarto eje queda cableado hasta el mando pero sin asignar: el conector P1 expone tres entradas analógicas, de modo que aprovecharlo exigiría multiplexar una de ellas. La asignación se muestra en la Figura 2.</w:t>
       </w:r>
     </w:p>
     <w:p>
@@ -4765,7 +4765,7 @@
                 <w:szCs w:val="19"/>
                 <w:lang w:val="es-AR"/>
               </w:rPr>
-              <w:t>Entrada del conversor analógico-digital</w:t>
+              <w:t>Reserva, sin asignar (sección 3.3)</w:t>
             </w:r>
           </w:p>
         </w:tc>
@@ -5280,7 +5280,7 @@
         <w:rPr>
           <w:lang w:val="es-AR"/>
         </w:rPr>
-        <w:t>Para garantizar la compatibilidad con las especificaciones del microcontrolador LPC4337 y preservar la integridad de las entradas analógicas (cuyo fondo de escala es de 3,3 V), los potenciómetros de mando se alimentan directamente desde la rama lógica de la placa. Las consignas de control para los servomotores se generan mediante canales de temporización y modulación por ancho de pulso agrupados en la tira digital P2. La distribución adoptada se resume a continuación:</w:t>
+        <w:t>Para garantizar la compatibilidad con las especificaciones del microcontrolador LPC4337 y preservar la integridad de las entradas analógicas (cuyo fondo de escala es de 3,3 V), los potenciómetros de mando se alimentan directamente desde la rama lógica de la placa. Las consignas de control para los servomotores se generan mediante canales de temporización y modulación por ancho de pulso de los conectores de expansión. La distribución adoptada se resume a continuación:</w:t>
       </w:r>
     </w:p>
     <w:p>
@@ -5364,7 +5364,7 @@
           <w:bCs/>
           <w:lang w:val="es-AR"/>
         </w:rPr>
-        <w:t>Pin 2 (</w:t>
+        <w:t>Pin 7 (</w:t>
       </w:r>
       <w:r>
         <w:rPr>
@@ -5373,7 +5373,7 @@
           <w:bCs/>
           <w:lang w:val="es-AR"/>
         </w:rPr>
-        <w:t>ANALOG_GND</w:t>
+        <w:t>GNDA</w:t>
       </w:r>
       <w:r>
         <w:rPr>
@@ -5409,7 +5409,7 @@
           <w:bCs/>
           <w:lang w:val="es-AR"/>
         </w:rPr>
-        <w:t>Pin 3 (</w:t>
+        <w:t>Pin 9 (</w:t>
       </w:r>
       <w:r>
         <w:rPr>
@@ -5418,7 +5418,7 @@
           <w:bCs/>
           <w:lang w:val="es-AR"/>
         </w:rPr>
-        <w:t>ADC0_3</w:t>
+        <w:t>CH3</w:t>
       </w:r>
       <w:r>
         <w:rPr>
@@ -5454,7 +5454,7 @@
           <w:bCs/>
           <w:lang w:val="es-AR"/>
         </w:rPr>
-        <w:t>Pin 5 (</w:t>
+        <w:t>Pin 11 (</w:t>
       </w:r>
       <w:r>
         <w:rPr>
@@ -5463,7 +5463,7 @@
           <w:bCs/>
           <w:lang w:val="es-AR"/>
         </w:rPr>
-        <w:t>ADC0_2</w:t>
+        <w:t>CH2</w:t>
       </w:r>
       <w:r>
         <w:rPr>
@@ -5499,7 +5499,7 @@
           <w:bCs/>
           <w:lang w:val="es-AR"/>
         </w:rPr>
-        <w:t>Pin 7 (</w:t>
+        <w:t>Pin 13 (</w:t>
       </w:r>
       <w:r>
         <w:rPr>
@@ -5508,7 +5508,7 @@
           <w:bCs/>
           <w:lang w:val="es-AR"/>
         </w:rPr>
-        <w:t>ADC0_1</w:t>
+        <w:t>CH1</w:t>
       </w:r>
       <w:r>
         <w:rPr>
@@ -5523,51 +5523,6 @@
           <w:lang w:val="es-AR"/>
         </w:rPr>
         <w:t xml:space="preserve"> Entrada analógica para el eje Y del Joystick A (control de elevación del hombro). </w:t>
-      </w:r>
-    </w:p>
-    <w:p>
-      <w:pPr>
-        <w:pStyle w:val="ListParagraph"/>
-        <w:numPr>
-          <w:ilvl w:val="0"/>
-          <w:numId w:val="2"/>
-        </w:numPr>
-        <w:spacing w:after="240"/>
-        <w:jc w:val="both"/>
-        <w:rPr>
-          <w:lang w:val="es-AR"/>
-        </w:rPr>
-      </w:pPr>
-      <w:r>
-        <w:rPr>
-          <w:b w:val="1"/>
-          <w:bCs w:val="1"/>
-          <w:lang w:val="es-AR"/>
-        </w:rPr>
-        <w:t>Pin 9 (</w:t>
-      </w:r>
-      <w:r>
-        <w:rPr>
-          <w:rFonts w:ascii="Consolas" w:hAnsi="Consolas" w:eastAsia="Consolas" w:cs="Consolas"/>
-          <w:b w:val="1"/>
-          <w:bCs w:val="1"/>
-          <w:lang w:val="es-AR"/>
-        </w:rPr>
-        <w:t>DAC / ADC0_0</w:t>
-      </w:r>
-      <w:r>
-        <w:rPr>
-          <w:b w:val="1"/>
-          <w:bCs w:val="1"/>
-          <w:lang w:val="es-AR"/>
-        </w:rPr>
-        <w:t>):</w:t>
-      </w:r>
-      <w:r>
-        <w:rPr>
-          <w:lang w:val="es-AR"/>
-        </w:rPr>
-        <w:t xml:space="preserve"> Entrada analógica multiplexada para el eje Y del Joystick B (eje de reserva: la orientación de la muñeca la calcula el firmware).</w:t>
       </w:r>
     </w:p>
     <w:p>
@@ -5795,7 +5750,7 @@
           <w:bCs/>
           <w:lang w:val="es-AR"/>
         </w:rPr>
-        <w:t>GPIO_GND</w:t>
+        <w:t>GPIO0</w:t>
       </w:r>
       <w:r>
         <w:rPr>
@@ -5809,7 +5764,21 @@
         <w:rPr>
           <w:lang w:val="es-AR"/>
         </w:rPr>
-        <w:t xml:space="preserve"> Unión de referencia al plano de masa común de potencia y lógica. </w:t>
+        <w:t xml:space="preserve"> Entrada digital con resistencia de </w:t>
+      </w:r>
+      <w:r>
+        <w:rPr>
+          <w:i/>
+          <w:iCs/>
+          <w:lang w:val="es-AR"/>
+        </w:rPr>
+        <w:t xml:space="preserve">pull-up</w:t>
+      </w:r>
+      <w:r>
+        <w:rPr>
+          <w:lang w:val="es-AR"/>
+        </w:rPr>
+        <w:t xml:space="preserve"> para el pulsador de apertura/cierre de la pinza. </w:t>
       </w:r>
     </w:p>
     <w:p>
@@ -5831,7 +5800,7 @@
           <w:bCs/>
           <w:lang w:val="es-AR"/>
         </w:rPr>
-        <w:t>Pin 31 (</w:t>
+        <w:t>Pin 39 (</w:t>
       </w:r>
       <w:r>
         <w:rPr>
@@ -5840,7 +5809,7 @@
           <w:bCs/>
           <w:lang w:val="es-AR"/>
         </w:rPr>
-        <w:t>GPIO0</w:t>
+        <w:t>GND</w:t>
       </w:r>
       <w:r>
         <w:rPr>
@@ -5854,21 +5823,7 @@
         <w:rPr>
           <w:lang w:val="es-AR"/>
         </w:rPr>
-        <w:t xml:space="preserve"> Entrada digital con resistencia de </w:t>
-      </w:r>
-      <w:r>
-        <w:rPr>
-          <w:i/>
-          <w:iCs/>
-          <w:lang w:val="es-AR"/>
-        </w:rPr>
-        <w:t xml:space="preserve">pull-up</w:t>
-      </w:r>
-      <w:r>
-        <w:rPr>
-          <w:lang w:val="es-AR"/>
-        </w:rPr>
-        <w:t xml:space="preserve"> para el pulsador de apertura/cierre de la pinza. </w:t>
+        <w:t xml:space="preserve"> Unión de referencia al plano de masa común de potencia y lógica. </w:t>
       </w:r>
     </w:p>
     <w:p>
@@ -5930,7 +5885,7 @@
           <w:noProof w:val="0"/>
           <w:lang w:val="es-AR"/>
         </w:rPr>
-        <w:t xml:space="preserve">Las cuatro salidas de modulación de los ejes del brazo se asignaron al conector P1, que es donde el módulo sapi_servo de la biblioteca de la cátedra mapea sus salidas por defecto, y la de la pinza al pin 40 del conector P2. Con ese reparto no hace falta redefinir el mapa de pines interno del driver ni migrar las conexiones físicas en la etapa de integración.</w:t>
+        <w:t xml:space="preserve">Las cuatro salidas de modulación de los ejes del brazo se asignaron al conector P1, que es donde el módulo sapi_servo de la biblioteca de la cátedra mapea sus salidas por defecto, y la de la pinza al pin 40 del conector P2. Con ese reparto no hace falta redefinir el mapa de pines interno del driver ni migrar las conexiones físicas en la etapa de integración. Los números de pin de ambos conectores corresponden a la documentación de la placa [11].</w:t>
       </w:r>
       <w:r>
         <w:rPr>
@@ -12010,7 +11965,7 @@
                 <w:szCs w:val="19"/>
                 <w:lang w:val="es-AR"/>
               </w:rPr>
-              <w:t>Sin asignar, o ajuste fino de la muñeca sobre el ángulo calculado</w:t>
+              <w:t>Sin asignar, o multiplexar una de las tres entradas analógicas de P1 para el ajuste fino de la muñeca</w:t>
             </w:r>
           </w:p>
         </w:tc>
@@ -12484,6 +12439,24 @@
           <w:lang w:val="es-AR"/>
         </w:rPr>
         <w:t>[10] Labcenter Electronics. Proteus Design Suite — Schematic Capture [portal del producto]. Disponible en: https://www.labcenter.com/schematic/ (visitado 3-10-2026).</w:t>
+      </w:r>
+    </w:p>
+    <w:p>
+      <w:pPr>
+        <w:spacing w:after="140" w:line="280" w:lineRule="auto"/>
+        <w:ind w:left="567" w:hanging="567"/>
+        <w:jc w:val="both"/>
+        <w:rPr>
+          <w:lang w:val="es-AR"/>
+        </w:rPr>
+      </w:pPr>
+      <w:r>
+        <w:rPr>
+          <w:sz w:val="22"/>
+          <w:szCs w:val="22"/>
+          <w:lang w:val="es-AR"/>
+        </w:rPr>
+        <w:t>[11] Proyecto CIAA. EDU-CIAA-NXP v1.1 Board [documentación de la placa], rev. 5r0, 3-1-2019.</w:t>
       </w:r>
     </w:p>
     <w:p>
@@ -12516,7 +12489,7 @@
         <w:rPr>
           <w:lang w:val="es-AR"/>
         </w:rPr>
-        <w:t>Corresponde a la sección 3.5, donde se describen el criterio de diseño y la asignación de pines de los conectores P1 y P2.</w:t>
+        <w:t>Corresponde a la sección 3.5, donde se describen el criterio de diseño y la asignación de pines de los conectores P1 y P2. El plano reproduce la numeración previa de las entradas analógicas y de la entrada digital; rige la de la sección 3.5, y su actualización en el archivo de KiCad queda registrada en la Tabla 9.</w:t>
       </w:r>
     </w:p>
     <w:p>

</xml_diff>